<commit_message>
REFactor: Update template variable names in README, JSON files, and constants for consistency
- Renamed template variables from Spanish to camelCase format for better readability and consistency across the project.
- Updated related JSON files and constants to reflect these changes, ensuring all references are aligned.
- Adjusted the README to provide accurate examples of the new variable names.
</commit_message>
<xml_diff>
--- a/src/template.docx
+++ b/src/template.docx
@@ -32,6 +32,7 @@
             <w:pPr>
               <w:pStyle w:val="Normal"/>
               <w:widowControl/>
+              <w:suppressAutoHyphens w:val="true"/>
               <w:spacing w:lineRule="auto" w:line="240" w:before="0" w:after="0"/>
               <w:jc w:val="center"/>
               <w:rPr>
@@ -114,6 +115,7 @@
             <w:pPr>
               <w:pStyle w:val="Normal"/>
               <w:widowControl/>
+              <w:suppressAutoHyphens w:val="true"/>
               <w:spacing w:lineRule="auto" w:line="240" w:before="0" w:after="0"/>
               <w:jc w:val="left"/>
               <w:rPr>
@@ -149,6 +151,7 @@
             <w:pPr>
               <w:pStyle w:val="Normal"/>
               <w:widowControl/>
+              <w:suppressAutoHyphens w:val="true"/>
               <w:spacing w:lineRule="auto" w:line="240" w:before="0" w:after="0"/>
               <w:jc w:val="center"/>
               <w:rPr>
@@ -165,7 +168,7 @@
                 <w:szCs w:val="28"/>
                 <w:lang w:val="en-US" w:eastAsia="en-US" w:bidi="ar-SA"/>
               </w:rPr>
-              <w:t>{tituloSesion}</w:t>
+              <w:t>{titulosesion}</w:t>
             </w:r>
           </w:p>
         </w:tc>
@@ -223,6 +226,7 @@
             <w:pPr>
               <w:pStyle w:val="Normal"/>
               <w:widowControl/>
+              <w:suppressAutoHyphens w:val="true"/>
               <w:spacing w:lineRule="auto" w:line="240" w:before="0" w:after="0"/>
               <w:jc w:val="left"/>
               <w:rPr>
@@ -261,6 +265,7 @@
             <w:pPr>
               <w:pStyle w:val="Normal"/>
               <w:widowControl/>
+              <w:suppressAutoHyphens w:val="true"/>
               <w:spacing w:lineRule="auto" w:line="240" w:before="0" w:after="0"/>
               <w:jc w:val="left"/>
               <w:rPr>
@@ -279,27 +284,7 @@
                 <w:szCs w:val="22"/>
                 <w:lang w:val="es-PE" w:eastAsia="en-US" w:bidi="ar-SA"/>
               </w:rPr>
-              <w:t xml:space="preserve">Docente: </w:t>
-            </w:r>
-            <w:r>
-              <w:rPr>
-                <w:rFonts w:eastAsia="Calibri" w:cs="Arial"/>
-                <w:kern w:val="2"/>
-                <w:sz w:val="22"/>
-                <w:szCs w:val="22"/>
-                <w:lang w:val="es-PE" w:eastAsia="en-US" w:bidi="ar-SA"/>
-              </w:rPr>
-              <w:t>{docente}</w:t>
-            </w:r>
-            <w:r>
-              <w:rPr>
-                <w:rFonts w:eastAsia="Calibri" w:cs="Arial"/>
-                <w:kern w:val="2"/>
-                <w:sz w:val="22"/>
-                <w:szCs w:val="22"/>
-                <w:lang w:val="es-PE" w:eastAsia="en-US" w:bidi="ar-SA"/>
-              </w:rPr>
-              <w:t xml:space="preserve">  </w:t>
+              <w:t>Docente: {nombredocente}</w:t>
             </w:r>
           </w:p>
         </w:tc>
@@ -315,6 +300,7 @@
             <w:pPr>
               <w:pStyle w:val="Normal"/>
               <w:widowControl/>
+              <w:suppressAutoHyphens w:val="true"/>
               <w:spacing w:lineRule="auto" w:line="240" w:before="0" w:after="0"/>
               <w:jc w:val="left"/>
               <w:rPr>
@@ -329,27 +315,7 @@
                 <w:szCs w:val="22"/>
                 <w:lang w:val="es-PE" w:eastAsia="en-US" w:bidi="ar-SA"/>
               </w:rPr>
-              <w:t xml:space="preserve">Institución Educativa: </w:t>
-            </w:r>
-            <w:r>
-              <w:rPr>
-                <w:rFonts w:eastAsia="Calibri" w:cs="Arial"/>
-                <w:kern w:val="2"/>
-                <w:sz w:val="22"/>
-                <w:szCs w:val="22"/>
-                <w:lang w:val="es-PE" w:eastAsia="en-US" w:bidi="ar-SA"/>
-              </w:rPr>
-              <w:t>{institucionEducativa}</w:t>
-            </w:r>
-            <w:r>
-              <w:rPr>
-                <w:rFonts w:eastAsia="Calibri" w:cs="Arial"/>
-                <w:kern w:val="2"/>
-                <w:sz w:val="22"/>
-                <w:szCs w:val="22"/>
-                <w:lang w:val="es-PE" w:eastAsia="en-US" w:bidi="ar-SA"/>
-              </w:rPr>
-              <w:t xml:space="preserve"> </w:t>
+              <w:t>Institución Educativa: {ie}</w:t>
             </w:r>
           </w:p>
         </w:tc>
@@ -395,17 +361,17 @@
         <w:tblLook w:val="04a0" w:noHBand="0" w:noVBand="1" w:firstColumn="1" w:lastRow="0" w:lastColumn="0" w:firstRow="1"/>
       </w:tblPr>
       <w:tblGrid>
-        <w:gridCol w:w="2195"/>
-        <w:gridCol w:w="2204"/>
         <w:gridCol w:w="2193"/>
-        <w:gridCol w:w="2124"/>
+        <w:gridCol w:w="2206"/>
+        <w:gridCol w:w="2191"/>
+        <w:gridCol w:w="2126"/>
         <w:gridCol w:w="2074"/>
       </w:tblGrid>
       <w:tr>
         <w:trPr/>
         <w:tc>
           <w:tcPr>
-            <w:tcW w:w="2195" w:type="dxa"/>
+            <w:tcW w:w="2193" w:type="dxa"/>
             <w:tcBorders/>
             <w:shd w:color="auto" w:fill="2F4060" w:val="clear"/>
           </w:tcPr>
@@ -413,6 +379,7 @@
             <w:pPr>
               <w:pStyle w:val="Normal"/>
               <w:widowControl/>
+              <w:suppressAutoHyphens w:val="true"/>
               <w:spacing w:lineRule="auto" w:line="240" w:before="0" w:after="0"/>
               <w:jc w:val="center"/>
               <w:rPr>
@@ -440,7 +407,7 @@
         </w:tc>
         <w:tc>
           <w:tcPr>
-            <w:tcW w:w="2204" w:type="dxa"/>
+            <w:tcW w:w="2206" w:type="dxa"/>
             <w:tcBorders/>
             <w:shd w:color="auto" w:fill="2F4060" w:val="clear"/>
           </w:tcPr>
@@ -448,6 +415,7 @@
             <w:pPr>
               <w:pStyle w:val="Normal"/>
               <w:widowControl/>
+              <w:suppressAutoHyphens w:val="true"/>
               <w:spacing w:lineRule="auto" w:line="240" w:before="0" w:after="0"/>
               <w:jc w:val="center"/>
               <w:rPr>
@@ -475,7 +443,7 @@
         </w:tc>
         <w:tc>
           <w:tcPr>
-            <w:tcW w:w="2193" w:type="dxa"/>
+            <w:tcW w:w="2191" w:type="dxa"/>
             <w:tcBorders/>
             <w:shd w:color="auto" w:fill="2F4060" w:val="clear"/>
           </w:tcPr>
@@ -483,6 +451,7 @@
             <w:pPr>
               <w:pStyle w:val="Normal"/>
               <w:widowControl/>
+              <w:suppressAutoHyphens w:val="true"/>
               <w:spacing w:lineRule="auto" w:line="240" w:before="0" w:after="0"/>
               <w:jc w:val="center"/>
               <w:rPr>
@@ -510,7 +479,7 @@
         </w:tc>
         <w:tc>
           <w:tcPr>
-            <w:tcW w:w="2124" w:type="dxa"/>
+            <w:tcW w:w="2126" w:type="dxa"/>
             <w:tcBorders/>
             <w:shd w:color="auto" w:fill="2F4060" w:val="clear"/>
           </w:tcPr>
@@ -518,6 +487,7 @@
             <w:pPr>
               <w:pStyle w:val="Normal"/>
               <w:widowControl/>
+              <w:suppressAutoHyphens w:val="true"/>
               <w:spacing w:lineRule="auto" w:line="240" w:before="0" w:after="0"/>
               <w:jc w:val="center"/>
               <w:rPr>
@@ -553,6 +523,7 @@
             <w:pPr>
               <w:pStyle w:val="Normal"/>
               <w:widowControl/>
+              <w:suppressAutoHyphens w:val="true"/>
               <w:spacing w:lineRule="auto" w:line="240" w:before="0" w:after="0"/>
               <w:jc w:val="center"/>
               <w:rPr>
@@ -585,13 +556,14 @@
         </w:trPr>
         <w:tc>
           <w:tcPr>
-            <w:tcW w:w="2195" w:type="dxa"/>
-            <w:tcBorders/>
-          </w:tcPr>
-          <w:p>
-            <w:pPr>
-              <w:pStyle w:val="Normal"/>
-              <w:widowControl/>
+            <w:tcW w:w="2193" w:type="dxa"/>
+            <w:tcBorders/>
+          </w:tcPr>
+          <w:p>
+            <w:pPr>
+              <w:pStyle w:val="Normal"/>
+              <w:widowControl/>
+              <w:suppressAutoHyphens w:val="true"/>
               <w:spacing w:lineRule="auto" w:line="240" w:before="0" w:after="0"/>
               <w:jc w:val="center"/>
               <w:rPr>
@@ -612,13 +584,14 @@
         </w:tc>
         <w:tc>
           <w:tcPr>
-            <w:tcW w:w="2204" w:type="dxa"/>
-            <w:tcBorders/>
-          </w:tcPr>
-          <w:p>
-            <w:pPr>
-              <w:pStyle w:val="Normal"/>
-              <w:widowControl/>
+            <w:tcW w:w="2206" w:type="dxa"/>
+            <w:tcBorders/>
+          </w:tcPr>
+          <w:p>
+            <w:pPr>
+              <w:pStyle w:val="Normal"/>
+              <w:widowControl/>
+              <w:suppressAutoHyphens w:val="true"/>
               <w:spacing w:lineRule="auto" w:line="240" w:before="0" w:after="0"/>
               <w:jc w:val="center"/>
               <w:rPr>
@@ -643,13 +616,14 @@
         </w:tc>
         <w:tc>
           <w:tcPr>
-            <w:tcW w:w="2193" w:type="dxa"/>
-            <w:tcBorders/>
-          </w:tcPr>
-          <w:p>
-            <w:pPr>
-              <w:pStyle w:val="Normal"/>
-              <w:widowControl/>
+            <w:tcW w:w="2191" w:type="dxa"/>
+            <w:tcBorders/>
+          </w:tcPr>
+          <w:p>
+            <w:pPr>
+              <w:pStyle w:val="Normal"/>
+              <w:widowControl/>
+              <w:suppressAutoHyphens w:val="true"/>
               <w:spacing w:lineRule="auto" w:line="240" w:before="0" w:after="0"/>
               <w:jc w:val="center"/>
               <w:rPr>
@@ -674,13 +648,14 @@
         </w:tc>
         <w:tc>
           <w:tcPr>
-            <w:tcW w:w="2124" w:type="dxa"/>
-            <w:tcBorders/>
-          </w:tcPr>
-          <w:p>
-            <w:pPr>
-              <w:pStyle w:val="Normal"/>
-              <w:widowControl/>
+            <w:tcW w:w="2126" w:type="dxa"/>
+            <w:tcBorders/>
+          </w:tcPr>
+          <w:p>
+            <w:pPr>
+              <w:pStyle w:val="Normal"/>
+              <w:widowControl/>
+              <w:suppressAutoHyphens w:val="true"/>
               <w:spacing w:lineRule="auto" w:line="240" w:before="0" w:after="0"/>
               <w:jc w:val="center"/>
               <w:rPr>
@@ -712,6 +687,7 @@
             <w:pPr>
               <w:pStyle w:val="Normal"/>
               <w:widowControl/>
+              <w:suppressAutoHyphens w:val="true"/>
               <w:spacing w:lineRule="auto" w:line="240" w:before="0" w:after="0"/>
               <w:jc w:val="center"/>
               <w:rPr>
@@ -773,8 +749,8 @@
         <w:tblLook w:val="04a0" w:noHBand="0" w:noVBand="1" w:firstColumn="1" w:lastRow="0" w:lastColumn="0" w:firstRow="1"/>
       </w:tblPr>
       <w:tblGrid>
-        <w:gridCol w:w="2249"/>
-        <w:gridCol w:w="2161"/>
+        <w:gridCol w:w="2247"/>
+        <w:gridCol w:w="2163"/>
         <w:gridCol w:w="2250"/>
         <w:gridCol w:w="2070"/>
         <w:gridCol w:w="2160"/>
@@ -794,6 +770,7 @@
             <w:pPr>
               <w:pStyle w:val="Normal"/>
               <w:widowControl/>
+              <w:suppressAutoHyphens w:val="true"/>
               <w:spacing w:lineRule="auto" w:line="240" w:before="0" w:after="0"/>
               <w:jc w:val="left"/>
               <w:rPr>
@@ -826,7 +803,7 @@
         </w:trPr>
         <w:tc>
           <w:tcPr>
-            <w:tcW w:w="2249" w:type="dxa"/>
+            <w:tcW w:w="2247" w:type="dxa"/>
             <w:tcBorders/>
             <w:shd w:color="auto" w:fill="2F4060" w:val="clear"/>
           </w:tcPr>
@@ -834,6 +811,7 @@
             <w:pPr>
               <w:pStyle w:val="Normal"/>
               <w:widowControl/>
+              <w:suppressAutoHyphens w:val="true"/>
               <w:spacing w:lineRule="auto" w:line="240" w:before="0" w:after="0"/>
               <w:jc w:val="center"/>
               <w:rPr>
@@ -855,7 +833,7 @@
         </w:tc>
         <w:tc>
           <w:tcPr>
-            <w:tcW w:w="2161" w:type="dxa"/>
+            <w:tcW w:w="2163" w:type="dxa"/>
             <w:tcBorders/>
             <w:shd w:color="auto" w:fill="2F4060" w:val="clear"/>
           </w:tcPr>
@@ -863,6 +841,7 @@
             <w:pPr>
               <w:pStyle w:val="Normal"/>
               <w:widowControl/>
+              <w:suppressAutoHyphens w:val="true"/>
               <w:spacing w:lineRule="auto" w:line="240" w:before="0" w:after="0"/>
               <w:jc w:val="center"/>
               <w:rPr>
@@ -892,6 +871,7 @@
             <w:pPr>
               <w:pStyle w:val="Normal"/>
               <w:widowControl/>
+              <w:suppressAutoHyphens w:val="true"/>
               <w:spacing w:lineRule="auto" w:line="240" w:before="0" w:after="0"/>
               <w:jc w:val="center"/>
               <w:rPr>
@@ -921,6 +901,7 @@
             <w:pPr>
               <w:pStyle w:val="Normal"/>
               <w:widowControl/>
+              <w:suppressAutoHyphens w:val="true"/>
               <w:spacing w:lineRule="auto" w:line="240" w:before="0" w:after="0"/>
               <w:jc w:val="center"/>
               <w:rPr>
@@ -950,6 +931,7 @@
             <w:pPr>
               <w:pStyle w:val="Normal"/>
               <w:widowControl/>
+              <w:suppressAutoHyphens w:val="true"/>
               <w:spacing w:lineRule="auto" w:line="240" w:before="0" w:after="0"/>
               <w:jc w:val="center"/>
               <w:rPr>
@@ -976,13 +958,14 @@
         </w:trPr>
         <w:tc>
           <w:tcPr>
-            <w:tcW w:w="2249" w:type="dxa"/>
-            <w:tcBorders/>
-          </w:tcPr>
-          <w:p>
-            <w:pPr>
-              <w:pStyle w:val="Normal"/>
-              <w:widowControl/>
+            <w:tcW w:w="2247" w:type="dxa"/>
+            <w:tcBorders/>
+          </w:tcPr>
+          <w:p>
+            <w:pPr>
+              <w:pStyle w:val="Normal"/>
+              <w:widowControl/>
+              <w:suppressAutoHyphens w:val="true"/>
               <w:spacing w:lineRule="auto" w:line="240" w:before="0" w:after="0"/>
               <w:jc w:val="left"/>
               <w:rPr>
@@ -998,29 +981,20 @@
                 <w:szCs w:val="18"/>
                 <w:lang w:val="es-PE" w:eastAsia="en-US" w:bidi="ar-SA"/>
               </w:rPr>
-              <w:t>{competencias}</w:t>
-            </w:r>
-            <w:r>
-              <w:rPr>
-                <w:rFonts w:eastAsia="Calibri" w:cs="Arial"/>
-                <w:kern w:val="2"/>
-                <w:sz w:val="18"/>
-                <w:szCs w:val="18"/>
-                <w:lang w:val="es-PE" w:eastAsia="en-US" w:bidi="ar-SA"/>
-              </w:rPr>
-              <w:t xml:space="preserve"> </w:t>
-            </w:r>
-          </w:p>
-        </w:tc>
-        <w:tc>
-          <w:tcPr>
-            <w:tcW w:w="2161" w:type="dxa"/>
-            <w:tcBorders/>
-          </w:tcPr>
-          <w:p>
-            <w:pPr>
-              <w:pStyle w:val="Normal"/>
-              <w:widowControl/>
+              <w:t>{Competencias}</w:t>
+            </w:r>
+          </w:p>
+        </w:tc>
+        <w:tc>
+          <w:tcPr>
+            <w:tcW w:w="2163" w:type="dxa"/>
+            <w:tcBorders/>
+          </w:tcPr>
+          <w:p>
+            <w:pPr>
+              <w:pStyle w:val="Normal"/>
+              <w:widowControl/>
+              <w:suppressAutoHyphens w:val="true"/>
               <w:spacing w:lineRule="auto" w:line="240" w:before="0" w:after="0"/>
               <w:jc w:val="left"/>
               <w:rPr>
@@ -1036,7 +1010,7 @@
                 <w:szCs w:val="18"/>
                 <w:lang w:val="es-PE" w:eastAsia="en-US" w:bidi="ar-SA"/>
               </w:rPr>
-              <w:t>{capacidades}</w:t>
+              <w:t>{Capacidades}</w:t>
             </w:r>
           </w:p>
         </w:tc>
@@ -1049,6 +1023,7 @@
             <w:pPr>
               <w:pStyle w:val="Normal"/>
               <w:widowControl/>
+              <w:suppressAutoHyphens w:val="true"/>
               <w:spacing w:lineRule="auto" w:line="240" w:before="0" w:after="0"/>
               <w:jc w:val="left"/>
               <w:rPr>
@@ -1064,7 +1039,7 @@
                 <w:szCs w:val="18"/>
                 <w:lang w:val="es-PE" w:eastAsia="en-US" w:bidi="ar-SA"/>
               </w:rPr>
-              <w:t>{desempeños}</w:t>
+              <w:t>{Desempeños}</w:t>
             </w:r>
           </w:p>
         </w:tc>
@@ -1077,6 +1052,7 @@
             <w:pPr>
               <w:pStyle w:val="Normal"/>
               <w:widowControl/>
+              <w:suppressAutoHyphens w:val="true"/>
               <w:spacing w:lineRule="auto" w:line="240" w:before="0" w:after="0"/>
               <w:jc w:val="left"/>
               <w:rPr>
@@ -1092,7 +1068,27 @@
                 <w:szCs w:val="18"/>
                 <w:lang w:val="es-PE" w:eastAsia="en-US" w:bidi="ar-SA"/>
               </w:rPr>
-              <w:t>{criteriosDeEvaluacion}</w:t>
+              <w:t>{</w:t>
+            </w:r>
+            <w:r>
+              <w:rPr>
+                <w:rFonts w:eastAsia="Calibri" w:cs="Calibri" w:cstheme="minorHAnsi"/>
+                <w:kern w:val="2"/>
+                <w:sz w:val="20"/>
+                <w:szCs w:val="20"/>
+                <w:lang w:val="es-PE" w:eastAsia="en-US" w:bidi="ar-SA"/>
+              </w:rPr>
+              <w:t>Criterios</w:t>
+            </w:r>
+            <w:r>
+              <w:rPr>
+                <w:rFonts w:eastAsia="Calibri" w:cs="Arial"/>
+                <w:kern w:val="2"/>
+                <w:sz w:val="18"/>
+                <w:szCs w:val="18"/>
+                <w:lang w:val="es-PE" w:eastAsia="en-US" w:bidi="ar-SA"/>
+              </w:rPr>
+              <w:t>}</w:t>
             </w:r>
           </w:p>
         </w:tc>
@@ -1105,6 +1101,7 @@
             <w:pPr>
               <w:pStyle w:val="Normal"/>
               <w:widowControl/>
+              <w:suppressAutoHyphens w:val="true"/>
               <w:spacing w:lineRule="auto" w:line="240" w:before="0" w:after="0"/>
               <w:jc w:val="left"/>
               <w:rPr>
@@ -1120,7 +1117,27 @@
                 <w:szCs w:val="18"/>
                 <w:lang w:val="es-PE" w:eastAsia="en-US" w:bidi="ar-SA"/>
               </w:rPr>
-              <w:t>{instrumentosDeEvaluacion}</w:t>
+              <w:t>{</w:t>
+            </w:r>
+            <w:r>
+              <w:rPr>
+                <w:rFonts w:eastAsia="Calibri" w:cs="Calibri" w:cstheme="minorHAnsi"/>
+                <w:kern w:val="2"/>
+                <w:sz w:val="20"/>
+                <w:szCs w:val="20"/>
+                <w:lang w:val="es-PE" w:eastAsia="en-US" w:bidi="ar-SA"/>
+              </w:rPr>
+              <w:t>Evaluacion</w:t>
+            </w:r>
+            <w:r>
+              <w:rPr>
+                <w:rFonts w:eastAsia="Calibri" w:cs="Arial"/>
+                <w:kern w:val="2"/>
+                <w:sz w:val="18"/>
+                <w:szCs w:val="18"/>
+                <w:lang w:val="es-PE" w:eastAsia="en-US" w:bidi="ar-SA"/>
+              </w:rPr>
+              <w:t>}</w:t>
             </w:r>
           </w:p>
         </w:tc>
@@ -1178,6 +1195,7 @@
             <w:pPr>
               <w:pStyle w:val="Normal"/>
               <w:widowControl/>
+              <w:suppressAutoHyphens w:val="true"/>
               <w:spacing w:lineRule="auto" w:line="240" w:before="0" w:after="0"/>
               <w:jc w:val="center"/>
               <w:rPr>
@@ -1211,6 +1229,7 @@
             <w:pPr>
               <w:pStyle w:val="Normal"/>
               <w:widowControl/>
+              <w:suppressAutoHyphens w:val="true"/>
               <w:spacing w:lineRule="auto" w:line="240" w:before="0" w:after="0"/>
               <w:jc w:val="left"/>
               <w:rPr>
@@ -1226,7 +1245,27 @@
                 <w:szCs w:val="20"/>
                 <w:lang w:val="es-PE" w:eastAsia="en-US" w:bidi="ar-SA"/>
               </w:rPr>
-              <w:t>{estandarDeAprendizaje}</w:t>
+              <w:t>{</w:t>
+            </w:r>
+            <w:r>
+              <w:rPr>
+                <w:rFonts w:eastAsia="Calibri" w:cs="Calibri" w:cstheme="minorHAnsi"/>
+                <w:kern w:val="2"/>
+                <w:sz w:val="20"/>
+                <w:szCs w:val="20"/>
+                <w:lang w:val="es-PE" w:eastAsia="en-US" w:bidi="ar-SA"/>
+              </w:rPr>
+              <w:t>estandar</w:t>
+            </w:r>
+            <w:r>
+              <w:rPr>
+                <w:rFonts w:eastAsia="Calibri" w:cs="Arial"/>
+                <w:kern w:val="2"/>
+                <w:sz w:val="20"/>
+                <w:szCs w:val="20"/>
+                <w:lang w:val="es-PE" w:eastAsia="en-US" w:bidi="ar-SA"/>
+              </w:rPr>
+              <w:t>}</w:t>
             </w:r>
           </w:p>
         </w:tc>
@@ -1285,6 +1324,7 @@
             <w:pPr>
               <w:pStyle w:val="Normal"/>
               <w:widowControl/>
+              <w:suppressAutoHyphens w:val="true"/>
               <w:spacing w:lineRule="auto" w:line="240" w:before="0" w:after="0"/>
               <w:jc w:val="center"/>
               <w:rPr>
@@ -1318,6 +1358,7 @@
             <w:pPr>
               <w:pStyle w:val="Normal"/>
               <w:widowControl/>
+              <w:suppressAutoHyphens w:val="true"/>
               <w:spacing w:lineRule="auto" w:line="240" w:before="0" w:after="0"/>
               <w:jc w:val="center"/>
               <w:rPr>
@@ -1353,6 +1394,7 @@
             <w:pPr>
               <w:pStyle w:val="Normal"/>
               <w:widowControl/>
+              <w:suppressAutoHyphens w:val="true"/>
               <w:spacing w:lineRule="auto" w:line="240" w:before="0" w:after="0"/>
               <w:jc w:val="left"/>
               <w:rPr>
@@ -1368,7 +1410,27 @@
                 <w:szCs w:val="18"/>
                 <w:lang w:val="es-PE" w:eastAsia="en-US" w:bidi="ar-SA"/>
               </w:rPr>
-              <w:t>{proposito}</w:t>
+              <w:t>{</w:t>
+            </w:r>
+            <w:r>
+              <w:rPr>
+                <w:rFonts w:eastAsia="Calibri" w:cs="Calibri" w:cstheme="minorHAnsi"/>
+                <w:kern w:val="2"/>
+                <w:sz w:val="20"/>
+                <w:szCs w:val="20"/>
+                <w:lang w:val="es-PE" w:eastAsia="en-US" w:bidi="ar-SA"/>
+              </w:rPr>
+              <w:t>proposito</w:t>
+            </w:r>
+            <w:r>
+              <w:rPr>
+                <w:rFonts w:eastAsia="Calibri" w:cs="Arial"/>
+                <w:kern w:val="2"/>
+                <w:sz w:val="18"/>
+                <w:szCs w:val="18"/>
+                <w:lang w:val="es-PE" w:eastAsia="en-US" w:bidi="ar-SA"/>
+              </w:rPr>
+              <w:t>}</w:t>
             </w:r>
           </w:p>
         </w:tc>
@@ -1381,6 +1443,7 @@
             <w:pPr>
               <w:pStyle w:val="Normal"/>
               <w:widowControl/>
+              <w:suppressAutoHyphens w:val="true"/>
               <w:spacing w:lineRule="auto" w:line="240" w:before="0" w:after="0"/>
               <w:jc w:val="left"/>
               <w:rPr>
@@ -1396,7 +1459,27 @@
                 <w:szCs w:val="18"/>
                 <w:lang w:val="es-PE" w:eastAsia="en-US" w:bidi="ar-SA"/>
               </w:rPr>
-              <w:t>{evidencia}</w:t>
+              <w:t>{</w:t>
+            </w:r>
+            <w:r>
+              <w:rPr>
+                <w:rFonts w:eastAsia="Calibri" w:cs="Calibri" w:cstheme="minorHAnsi"/>
+                <w:kern w:val="2"/>
+                <w:sz w:val="20"/>
+                <w:szCs w:val="20"/>
+                <w:lang w:val="es-PE" w:eastAsia="en-US" w:bidi="ar-SA"/>
+              </w:rPr>
+              <w:t>evidencia</w:t>
+            </w:r>
+            <w:r>
+              <w:rPr>
+                <w:rFonts w:eastAsia="Calibri" w:cs="Arial"/>
+                <w:kern w:val="2"/>
+                <w:sz w:val="18"/>
+                <w:szCs w:val="18"/>
+                <w:lang w:val="es-PE" w:eastAsia="en-US" w:bidi="ar-SA"/>
+              </w:rPr>
+              <w:t>}</w:t>
             </w:r>
           </w:p>
         </w:tc>
@@ -1455,6 +1538,7 @@
             <w:pPr>
               <w:pStyle w:val="Normal"/>
               <w:widowControl/>
+              <w:suppressAutoHyphens w:val="true"/>
               <w:spacing w:lineRule="auto" w:line="240" w:before="0" w:after="0"/>
               <w:jc w:val="center"/>
               <w:rPr>
@@ -1488,6 +1572,7 @@
             <w:pPr>
               <w:pStyle w:val="Normal"/>
               <w:widowControl/>
+              <w:suppressAutoHyphens w:val="true"/>
               <w:spacing w:lineRule="auto" w:line="240" w:before="0" w:after="0"/>
               <w:jc w:val="center"/>
               <w:rPr>
@@ -1525,6 +1610,7 @@
             <w:pPr>
               <w:pStyle w:val="Normal"/>
               <w:widowControl/>
+              <w:suppressAutoHyphens w:val="true"/>
               <w:spacing w:lineRule="auto" w:line="240" w:before="0" w:after="0"/>
               <w:jc w:val="left"/>
               <w:rPr>
@@ -1540,7 +1626,27 @@
                 <w:szCs w:val="18"/>
                 <w:lang w:val="es-PE" w:eastAsia="en-US" w:bidi="ar-SA"/>
               </w:rPr>
-              <w:t>{competenciasTransversales}</w:t>
+              <w:t>{</w:t>
+            </w:r>
+            <w:r>
+              <w:rPr>
+                <w:rFonts w:eastAsia="Calibri" w:cs="Calibri" w:cstheme="minorHAnsi"/>
+                <w:kern w:val="2"/>
+                <w:sz w:val="20"/>
+                <w:szCs w:val="20"/>
+                <w:lang w:val="es-PE" w:eastAsia="en-US" w:bidi="ar-SA"/>
+              </w:rPr>
+              <w:t>competenciastrans</w:t>
+            </w:r>
+            <w:r>
+              <w:rPr>
+                <w:rFonts w:eastAsia="Calibri" w:cs="Arial"/>
+                <w:kern w:val="2"/>
+                <w:sz w:val="18"/>
+                <w:szCs w:val="18"/>
+                <w:lang w:val="es-PE" w:eastAsia="en-US" w:bidi="ar-SA"/>
+              </w:rPr>
+              <w:t>}</w:t>
             </w:r>
           </w:p>
         </w:tc>
@@ -1553,6 +1659,7 @@
             <w:pPr>
               <w:pStyle w:val="Normal"/>
               <w:widowControl/>
+              <w:suppressAutoHyphens w:val="true"/>
               <w:spacing w:lineRule="auto" w:line="240" w:before="0" w:after="0"/>
               <w:jc w:val="left"/>
               <w:rPr>
@@ -1568,7 +1675,27 @@
                 <w:szCs w:val="18"/>
                 <w:lang w:val="es-PE" w:eastAsia="en-US" w:bidi="ar-SA"/>
               </w:rPr>
-              <w:t>{capacidades}</w:t>
+              <w:t>{</w:t>
+            </w:r>
+            <w:r>
+              <w:rPr>
+                <w:rFonts w:eastAsia="Calibri" w:cs="Calibri" w:cstheme="minorHAnsi"/>
+                <w:kern w:val="2"/>
+                <w:sz w:val="20"/>
+                <w:szCs w:val="20"/>
+                <w:lang w:val="es-PE" w:eastAsia="en-US" w:bidi="ar-SA"/>
+              </w:rPr>
+              <w:t>capacidadestrans</w:t>
+            </w:r>
+            <w:r>
+              <w:rPr>
+                <w:rFonts w:eastAsia="Calibri" w:cs="Arial"/>
+                <w:kern w:val="2"/>
+                <w:sz w:val="18"/>
+                <w:szCs w:val="18"/>
+                <w:lang w:val="es-PE" w:eastAsia="en-US" w:bidi="ar-SA"/>
+              </w:rPr>
+              <w:t>}</w:t>
             </w:r>
           </w:p>
         </w:tc>
@@ -1628,6 +1755,7 @@
             <w:pPr>
               <w:pStyle w:val="Normal"/>
               <w:widowControl/>
+              <w:suppressAutoHyphens w:val="true"/>
               <w:spacing w:lineRule="auto" w:line="240" w:before="0" w:after="0"/>
               <w:jc w:val="center"/>
               <w:rPr>
@@ -1661,6 +1789,7 @@
             <w:pPr>
               <w:pStyle w:val="Normal"/>
               <w:widowControl/>
+              <w:suppressAutoHyphens w:val="true"/>
               <w:spacing w:lineRule="auto" w:line="240" w:before="0" w:after="0"/>
               <w:jc w:val="center"/>
               <w:rPr>
@@ -1694,6 +1823,7 @@
             <w:pPr>
               <w:pStyle w:val="Normal"/>
               <w:widowControl/>
+              <w:suppressAutoHyphens w:val="true"/>
               <w:spacing w:lineRule="auto" w:line="240" w:before="0" w:after="0"/>
               <w:jc w:val="center"/>
               <w:rPr>
@@ -1725,6 +1855,7 @@
             <w:pPr>
               <w:pStyle w:val="Normal"/>
               <w:widowControl/>
+              <w:suppressAutoHyphens w:val="true"/>
               <w:spacing w:lineRule="auto" w:line="240" w:before="0" w:after="0"/>
               <w:jc w:val="left"/>
               <w:rPr>
@@ -1743,37 +1874,58 @@
                 <w:szCs w:val="22"/>
                 <w:lang w:val="es-PE" w:eastAsia="en-US" w:bidi="ar-SA"/>
               </w:rPr>
-              <w:t>{enfoquesTransversales}</w:t>
-            </w:r>
-          </w:p>
-        </w:tc>
-        <w:tc>
-          <w:tcPr>
-            <w:tcW w:w="3150" w:type="dxa"/>
-            <w:tcBorders/>
-          </w:tcPr>
-          <w:p>
-            <w:pPr>
-              <w:pStyle w:val="Normal"/>
-              <w:widowControl/>
-              <w:spacing w:lineRule="auto" w:line="240" w:before="0" w:after="0"/>
-              <w:jc w:val="left"/>
-              <w:rPr>
-                <w:rFonts w:ascii="Calibri" w:hAnsi="Calibri" w:eastAsia="Calibri" w:cs="Arial"/>
+              <w:t>{</w:t>
+            </w:r>
+            <w:r>
+              <w:rPr>
+                <w:rFonts w:eastAsia="Calibri" w:cs="Calibri" w:cstheme="minorHAnsi"/>
+                <w:kern w:val="2"/>
+                <w:sz w:val="20"/>
+                <w:szCs w:val="20"/>
+                <w:lang w:val="es-PE" w:eastAsia="en-US" w:bidi="ar-SA"/>
+              </w:rPr>
+              <w:t>enfoques</w:t>
+            </w:r>
+            <w:r>
+              <w:rPr>
+                <w:rFonts w:eastAsia="Calibri" w:cs="Arial"/>
                 <w:kern w:val="2"/>
                 <w:sz w:val="22"/>
                 <w:szCs w:val="22"/>
                 <w:lang w:val="es-PE" w:eastAsia="en-US" w:bidi="ar-SA"/>
               </w:rPr>
-            </w:pPr>
-            <w:r>
-              <w:rPr>
-                <w:rFonts w:eastAsia="Calibri" w:cs="Arial"/>
+              <w:t>}</w:t>
+            </w:r>
+          </w:p>
+        </w:tc>
+        <w:tc>
+          <w:tcPr>
+            <w:tcW w:w="3150" w:type="dxa"/>
+            <w:tcBorders/>
+          </w:tcPr>
+          <w:p>
+            <w:pPr>
+              <w:pStyle w:val="Normal"/>
+              <w:widowControl/>
+              <w:suppressAutoHyphens w:val="true"/>
+              <w:spacing w:lineRule="auto" w:line="240" w:before="0" w:after="0"/>
+              <w:jc w:val="left"/>
+              <w:rPr>
+                <w:rFonts w:ascii="Calibri" w:hAnsi="Calibri" w:eastAsia="Calibri" w:cs="Arial"/>
                 <w:kern w:val="2"/>
                 <w:sz w:val="22"/>
                 <w:szCs w:val="22"/>
                 <w:lang w:val="es-PE" w:eastAsia="en-US" w:bidi="ar-SA"/>
               </w:rPr>
+            </w:pPr>
+            <w:r>
+              <w:rPr>
+                <w:rFonts w:eastAsia="Calibri" w:cs="Arial"/>
+                <w:kern w:val="2"/>
+                <w:sz w:val="22"/>
+                <w:szCs w:val="22"/>
+                <w:lang w:val="es-PE" w:eastAsia="en-US" w:bidi="ar-SA"/>
+              </w:rPr>
               <w:t>{valores}</w:t>
             </w:r>
           </w:p>
@@ -1787,6 +1939,7 @@
             <w:pPr>
               <w:pStyle w:val="Normal"/>
               <w:widowControl/>
+              <w:suppressAutoHyphens w:val="true"/>
               <w:spacing w:lineRule="auto" w:line="240" w:before="0" w:after="0"/>
               <w:jc w:val="left"/>
               <w:rPr>
@@ -1802,7 +1955,27 @@
                 <w:szCs w:val="18"/>
                 <w:lang w:val="es-PE" w:eastAsia="en-US" w:bidi="ar-SA"/>
               </w:rPr>
-              <w:t>{actitudes}</w:t>
+              <w:t>{</w:t>
+            </w:r>
+            <w:r>
+              <w:rPr>
+                <w:rFonts w:eastAsia="Calibri" w:cs="Calibri" w:cstheme="minorHAnsi"/>
+                <w:kern w:val="2"/>
+                <w:sz w:val="20"/>
+                <w:szCs w:val="20"/>
+                <w:lang w:val="es-PE" w:eastAsia="en-US" w:bidi="ar-SA"/>
+              </w:rPr>
+              <w:t>actitudes</w:t>
+            </w:r>
+            <w:r>
+              <w:rPr>
+                <w:rFonts w:eastAsia="Calibri" w:cs="Arial"/>
+                <w:kern w:val="2"/>
+                <w:sz w:val="18"/>
+                <w:szCs w:val="18"/>
+                <w:lang w:val="es-PE" w:eastAsia="en-US" w:bidi="ar-SA"/>
+              </w:rPr>
+              <w:t>}</w:t>
             </w:r>
           </w:p>
         </w:tc>
@@ -1862,6 +2035,7 @@
             <w:pPr>
               <w:pStyle w:val="Normal"/>
               <w:widowControl/>
+              <w:suppressAutoHyphens w:val="true"/>
               <w:spacing w:lineRule="auto" w:line="240" w:before="0" w:after="0"/>
               <w:jc w:val="left"/>
               <w:rPr>
@@ -1897,6 +2071,7 @@
             <w:pPr>
               <w:pStyle w:val="Normal"/>
               <w:widowControl/>
+              <w:suppressAutoHyphens w:val="true"/>
               <w:spacing w:lineRule="auto" w:line="240" w:before="0" w:after="0"/>
               <w:jc w:val="left"/>
               <w:rPr>
@@ -1909,14 +2084,11 @@
             </w:pPr>
             <w:r>
               <w:rPr>
-                <w:rFonts w:eastAsia="Calibri" w:cs="Arial"/>
                 <w:b/>
                 <w:bCs/>
                 <w:color w:themeColor="background1" w:val="FFFFFF"/>
-                <w:kern w:val="2"/>
                 <w:sz w:val="24"/>
                 <w:szCs w:val="24"/>
-                <w:lang w:val="es-PE" w:eastAsia="en-US" w:bidi="ar-SA"/>
               </w:rPr>
             </w:r>
           </w:p>
@@ -1933,6 +2105,7 @@
             <w:pPr>
               <w:pStyle w:val="Normal"/>
               <w:widowControl/>
+              <w:suppressAutoHyphens w:val="true"/>
               <w:spacing w:lineRule="auto" w:line="240" w:before="0" w:after="0"/>
               <w:jc w:val="left"/>
               <w:rPr>
@@ -1951,7 +2124,7 @@
                 <w:szCs w:val="22"/>
                 <w:lang w:val="es-PE" w:eastAsia="en-US" w:bidi="ar-SA"/>
               </w:rPr>
-              <w:t>Momentos</w:t>
+              <w:t>Momento</w:t>
             </w:r>
           </w:p>
         </w:tc>
@@ -1964,6 +2137,7 @@
             <w:pPr>
               <w:pStyle w:val="Normal"/>
               <w:widowControl/>
+              <w:suppressAutoHyphens w:val="true"/>
               <w:spacing w:lineRule="auto" w:line="240" w:before="0" w:after="0"/>
               <w:jc w:val="left"/>
               <w:rPr>
@@ -2005,6 +2179,7 @@
             <w:pPr>
               <w:pStyle w:val="Normal"/>
               <w:widowControl/>
+              <w:suppressAutoHyphens w:val="true"/>
               <w:spacing w:lineRule="auto" w:line="240" w:before="0" w:after="0"/>
               <w:jc w:val="left"/>
               <w:rPr>
@@ -2041,6 +2216,7 @@
             <w:pPr>
               <w:pStyle w:val="Normal"/>
               <w:widowControl/>
+              <w:suppressAutoHyphens w:val="true"/>
               <w:spacing w:lineRule="auto" w:line="240" w:before="0" w:after="0"/>
               <w:jc w:val="center"/>
               <w:rPr>
@@ -2069,6 +2245,7 @@
             <w:pPr>
               <w:pStyle w:val="Normal"/>
               <w:widowControl/>
+              <w:suppressAutoHyphens w:val="true"/>
               <w:spacing w:lineRule="auto" w:line="240" w:before="0" w:after="0"/>
               <w:jc w:val="left"/>
               <w:rPr>
@@ -2084,7 +2261,7 @@
                 <w:szCs w:val="18"/>
                 <w:lang w:val="es-PE" w:eastAsia="en-US" w:bidi="ar-SA"/>
               </w:rPr>
-              <w:t>{inicio}</w:t>
+              <w:t>{Inicio}</w:t>
             </w:r>
           </w:p>
         </w:tc>
@@ -2097,6 +2274,7 @@
             <w:pPr>
               <w:pStyle w:val="Normal"/>
               <w:widowControl/>
+              <w:suppressAutoHyphens w:val="true"/>
               <w:spacing w:lineRule="auto" w:line="240" w:before="0" w:after="0"/>
               <w:jc w:val="left"/>
               <w:rPr>
@@ -2112,7 +2290,27 @@
                 <w:szCs w:val="18"/>
                 <w:lang w:val="es-PE" w:eastAsia="en-US" w:bidi="ar-SA"/>
               </w:rPr>
-              <w:t>{inicioTiempo}</w:t>
+              <w:t>{</w:t>
+            </w:r>
+            <w:r>
+              <w:rPr>
+                <w:rFonts w:eastAsia="Calibri" w:cs="Calibri" w:cstheme="minorHAnsi"/>
+                <w:kern w:val="2"/>
+                <w:sz w:val="20"/>
+                <w:szCs w:val="20"/>
+                <w:lang w:val="es-PE" w:eastAsia="en-US" w:bidi="ar-SA"/>
+              </w:rPr>
+              <w:t>tiempoinicio</w:t>
+            </w:r>
+            <w:r>
+              <w:rPr>
+                <w:rFonts w:eastAsia="Calibri" w:cs="Arial"/>
+                <w:kern w:val="2"/>
+                <w:sz w:val="18"/>
+                <w:szCs w:val="18"/>
+                <w:lang w:val="es-PE" w:eastAsia="en-US" w:bidi="ar-SA"/>
+              </w:rPr>
+              <w:t>}</w:t>
             </w:r>
           </w:p>
         </w:tc>
@@ -2130,6 +2328,7 @@
             <w:pPr>
               <w:pStyle w:val="Normal"/>
               <w:widowControl/>
+              <w:suppressAutoHyphens w:val="true"/>
               <w:spacing w:lineRule="auto" w:line="240" w:before="0" w:after="0"/>
               <w:jc w:val="center"/>
               <w:rPr>
@@ -2148,7 +2347,7 @@
                 <w:szCs w:val="22"/>
                 <w:lang w:val="es-PE" w:eastAsia="en-US" w:bidi="ar-SA"/>
               </w:rPr>
-              <w:t xml:space="preserve">Desarrollo </w:t>
+              <w:t>Desarrollo</w:t>
             </w:r>
           </w:p>
         </w:tc>
@@ -2161,6 +2360,7 @@
             <w:pPr>
               <w:pStyle w:val="Normal"/>
               <w:widowControl/>
+              <w:suppressAutoHyphens w:val="true"/>
               <w:spacing w:lineRule="auto" w:line="240" w:before="0" w:after="0"/>
               <w:jc w:val="left"/>
               <w:rPr>
@@ -2176,7 +2376,7 @@
                 <w:szCs w:val="18"/>
                 <w:lang w:val="es-PE" w:eastAsia="en-US" w:bidi="ar-SA"/>
               </w:rPr>
-              <w:t>{desarrollo}</w:t>
+              <w:t>{Desarrollo}</w:t>
             </w:r>
           </w:p>
         </w:tc>
@@ -2189,6 +2389,7 @@
             <w:pPr>
               <w:pStyle w:val="Normal"/>
               <w:widowControl/>
+              <w:suppressAutoHyphens w:val="true"/>
               <w:spacing w:lineRule="auto" w:line="240" w:before="0" w:after="0"/>
               <w:jc w:val="left"/>
               <w:rPr>
@@ -2204,7 +2405,27 @@
                 <w:szCs w:val="18"/>
                 <w:lang w:val="es-PE" w:eastAsia="en-US" w:bidi="ar-SA"/>
               </w:rPr>
-              <w:t>{desarrolloTiempo}</w:t>
+              <w:t>{</w:t>
+            </w:r>
+            <w:r>
+              <w:rPr>
+                <w:rFonts w:eastAsia="Calibri" w:cs="Calibri" w:cstheme="minorHAnsi"/>
+                <w:kern w:val="2"/>
+                <w:sz w:val="20"/>
+                <w:szCs w:val="20"/>
+                <w:lang w:val="es-PE" w:eastAsia="en-US" w:bidi="ar-SA"/>
+              </w:rPr>
+              <w:t>tiempodesarollo</w:t>
+            </w:r>
+            <w:r>
+              <w:rPr>
+                <w:rFonts w:eastAsia="Calibri" w:cs="Arial"/>
+                <w:kern w:val="2"/>
+                <w:sz w:val="18"/>
+                <w:szCs w:val="18"/>
+                <w:lang w:val="es-PE" w:eastAsia="en-US" w:bidi="ar-SA"/>
+              </w:rPr>
+              <w:t>}</w:t>
             </w:r>
           </w:p>
         </w:tc>
@@ -2222,6 +2443,7 @@
             <w:pPr>
               <w:pStyle w:val="Normal"/>
               <w:widowControl/>
+              <w:suppressAutoHyphens w:val="true"/>
               <w:spacing w:lineRule="auto" w:line="240" w:before="0" w:after="0"/>
               <w:jc w:val="center"/>
               <w:rPr>
@@ -2253,6 +2475,7 @@
             <w:pPr>
               <w:pStyle w:val="Normal"/>
               <w:widowControl/>
+              <w:suppressAutoHyphens w:val="true"/>
               <w:spacing w:lineRule="auto" w:line="240" w:before="0" w:after="0"/>
               <w:jc w:val="left"/>
               <w:rPr>
@@ -2268,17 +2491,7 @@
                 <w:szCs w:val="18"/>
                 <w:lang w:val="es-PE" w:eastAsia="en-US" w:bidi="ar-SA"/>
               </w:rPr>
-              <w:t>{cierre}</w:t>
-            </w:r>
-            <w:r>
-              <w:rPr>
-                <w:rFonts w:eastAsia="Calibri" w:cs="Arial"/>
-                <w:kern w:val="2"/>
-                <w:sz w:val="18"/>
-                <w:szCs w:val="18"/>
-                <w:lang w:val="es-PE" w:eastAsia="en-US" w:bidi="ar-SA"/>
-              </w:rPr>
-              <w:t xml:space="preserve"> </w:t>
+              <w:t>{Cierre}</w:t>
             </w:r>
           </w:p>
         </w:tc>
@@ -2291,6 +2504,7 @@
             <w:pPr>
               <w:pStyle w:val="Normal"/>
               <w:widowControl/>
+              <w:suppressAutoHyphens w:val="true"/>
               <w:spacing w:lineRule="auto" w:line="240" w:before="0" w:after="0"/>
               <w:jc w:val="left"/>
               <w:rPr>
@@ -2306,7 +2520,27 @@
                 <w:szCs w:val="18"/>
                 <w:lang w:val="es-PE" w:eastAsia="en-US" w:bidi="ar-SA"/>
               </w:rPr>
-              <w:t>{cierreTiempo}</w:t>
+              <w:t>{</w:t>
+            </w:r>
+            <w:r>
+              <w:rPr>
+                <w:rFonts w:eastAsia="Calibri" w:cs="Calibri" w:cstheme="minorHAnsi"/>
+                <w:kern w:val="2"/>
+                <w:sz w:val="20"/>
+                <w:szCs w:val="20"/>
+                <w:lang w:val="es-PE" w:eastAsia="en-US" w:bidi="ar-SA"/>
+              </w:rPr>
+              <w:t>tiempocierre</w:t>
+            </w:r>
+            <w:r>
+              <w:rPr>
+                <w:rFonts w:eastAsia="Calibri" w:cs="Arial"/>
+                <w:kern w:val="2"/>
+                <w:sz w:val="18"/>
+                <w:szCs w:val="18"/>
+                <w:lang w:val="es-PE" w:eastAsia="en-US" w:bidi="ar-SA"/>
+              </w:rPr>
+              <w:t>}</w:t>
             </w:r>
           </w:p>
         </w:tc>
@@ -2386,6 +2620,7 @@
             <w:pPr>
               <w:pStyle w:val="Normal"/>
               <w:widowControl/>
+              <w:suppressAutoHyphens w:val="true"/>
               <w:spacing w:lineRule="auto" w:line="240" w:before="0" w:after="0"/>
               <w:jc w:val="left"/>
               <w:rPr>
@@ -2423,6 +2658,7 @@
             <w:pPr>
               <w:pStyle w:val="Normal"/>
               <w:widowControl/>
+              <w:suppressAutoHyphens w:val="true"/>
               <w:spacing w:lineRule="auto" w:line="240" w:before="0" w:after="0"/>
               <w:jc w:val="left"/>
               <w:rPr>
@@ -2438,7 +2674,27 @@
                 <w:szCs w:val="18"/>
                 <w:lang w:val="es-PE" w:eastAsia="en-US" w:bidi="ar-SA"/>
               </w:rPr>
-              <w:t>{ejerciciosRespuestas}</w:t>
+              <w:t>{</w:t>
+            </w:r>
+            <w:r>
+              <w:rPr>
+                <w:rFonts w:eastAsia="Calibri" w:cs="Calibri" w:cstheme="minorHAnsi"/>
+                <w:kern w:val="2"/>
+                <w:sz w:val="20"/>
+                <w:szCs w:val="20"/>
+                <w:lang w:val="es-PE" w:eastAsia="en-US" w:bidi="ar-SA"/>
+              </w:rPr>
+              <w:t>fichadeaprendizaje</w:t>
+            </w:r>
+            <w:r>
+              <w:rPr>
+                <w:rFonts w:eastAsia="Calibri" w:cs="Arial"/>
+                <w:kern w:val="2"/>
+                <w:sz w:val="18"/>
+                <w:szCs w:val="18"/>
+                <w:lang w:val="es-PE" w:eastAsia="en-US" w:bidi="ar-SA"/>
+              </w:rPr>
+              <w:t>}</w:t>
             </w:r>
           </w:p>
         </w:tc>
@@ -2992,7 +3248,7 @@
   <w:docDefaults>
     <w:rPrDefault>
       <w:rPr>
-        <w:rFonts w:ascii="Calibri" w:hAnsi="Calibri" w:eastAsia="Calibri" w:cs="Arial" w:asciiTheme="minorHAnsi" w:cstheme="minorBidi" w:eastAsiaTheme="minorHAnsi" w:hAnsiTheme="minorHAnsi"/>
+        <w:rFonts w:ascii="Calibri" w:hAnsi="Calibri" w:eastAsia="Calibri" w:cs="" w:asciiTheme="minorHAnsi" w:cstheme="minorBidi" w:eastAsiaTheme="minorHAnsi" w:hAnsiTheme="minorHAnsi"/>
         <w:kern w:val="2"/>
         <w:sz w:val="22"/>
         <w:szCs w:val="22"/>
@@ -3389,12 +3645,13 @@
     <w:qFormat/>
     <w:pPr>
       <w:widowControl/>
+      <w:suppressAutoHyphens w:val="true"/>
       <w:bidi w:val="0"/>
       <w:spacing w:lineRule="auto" w:line="259" w:before="0" w:after="160"/>
       <w:jc w:val="left"/>
     </w:pPr>
     <w:rPr>
-      <w:rFonts w:ascii="Calibri" w:hAnsi="Calibri" w:eastAsia="Calibri" w:cs="Arial" w:asciiTheme="minorHAnsi" w:cstheme="minorBidi" w:eastAsiaTheme="minorHAnsi" w:hAnsiTheme="minorHAnsi"/>
+      <w:rFonts w:ascii="Calibri" w:hAnsi="Calibri" w:eastAsia="Calibri" w:cs="" w:asciiTheme="minorHAnsi" w:cstheme="minorBidi" w:eastAsiaTheme="minorHAnsi" w:hAnsiTheme="minorHAnsi"/>
       <w:color w:val="auto"/>
       <w:kern w:val="2"/>
       <w:sz w:val="22"/>

</xml_diff>

<commit_message>
fix: unify {tiempocierre} placeholder into single run in template, improve LOG_REQUEST_BODY defaults
- template.docx: {tiempocierre} was split across multiple XML runs; consolidated into one <w:t> node
- server.js: add startup warning when LOG_REQUEST_BODY is active so Railway logs make it visible
- .env.example: change LOG_REQUEST_BODY default to 0 with clearer production guidance
</commit_message>
<xml_diff>
--- a/src/template.docx
+++ b/src/template.docx
@@ -284,7 +284,17 @@
                 <w:szCs w:val="22"/>
                 <w:lang w:val="es-PE" w:eastAsia="en-US" w:bidi="ar-SA"/>
               </w:rPr>
-              <w:t>Docente: {nombredocente}</w:t>
+              <w:t xml:space="preserve">Docente: </w:t>
+            </w:r>
+            <w:r>
+              <w:rPr>
+                <w:rFonts w:eastAsia="Calibri" w:cs="Arial"/>
+                <w:kern w:val="2"/>
+                <w:sz w:val="22"/>
+                <w:szCs w:val="22"/>
+                <w:lang w:val="es-PE" w:eastAsia="en-US" w:bidi="ar-SA"/>
+              </w:rPr>
+              <w:t>{nombredocente}</w:t>
             </w:r>
           </w:p>
         </w:tc>
@@ -315,7 +325,17 @@
                 <w:szCs w:val="22"/>
                 <w:lang w:val="es-PE" w:eastAsia="en-US" w:bidi="ar-SA"/>
               </w:rPr>
-              <w:t>Institución Educativa: {ie}</w:t>
+              <w:t xml:space="preserve">Institución Educativa: </w:t>
+            </w:r>
+            <w:r>
+              <w:rPr>
+                <w:rFonts w:eastAsia="Calibri" w:cs="Arial"/>
+                <w:kern w:val="2"/>
+                <w:sz w:val="22"/>
+                <w:szCs w:val="22"/>
+                <w:lang w:val="es-PE" w:eastAsia="en-US" w:bidi="ar-SA"/>
+              </w:rPr>
+              <w:t>{ie}</w:t>
             </w:r>
           </w:p>
         </w:tc>
@@ -361,8 +381,8 @@
         <w:tblLook w:val="04a0" w:noHBand="0" w:noVBand="1" w:firstColumn="1" w:lastRow="0" w:lastColumn="0" w:firstRow="1"/>
       </w:tblPr>
       <w:tblGrid>
-        <w:gridCol w:w="2193"/>
-        <w:gridCol w:w="2206"/>
+        <w:gridCol w:w="2192"/>
+        <w:gridCol w:w="2207"/>
         <w:gridCol w:w="2191"/>
         <w:gridCol w:w="2126"/>
         <w:gridCol w:w="2074"/>
@@ -371,7 +391,7 @@
         <w:trPr/>
         <w:tc>
           <w:tcPr>
-            <w:tcW w:w="2193" w:type="dxa"/>
+            <w:tcW w:w="2192" w:type="dxa"/>
             <w:tcBorders/>
             <w:shd w:color="auto" w:fill="2F4060" w:val="clear"/>
           </w:tcPr>
@@ -407,7 +427,7 @@
         </w:tc>
         <w:tc>
           <w:tcPr>
-            <w:tcW w:w="2206" w:type="dxa"/>
+            <w:tcW w:w="2207" w:type="dxa"/>
             <w:tcBorders/>
             <w:shd w:color="auto" w:fill="2F4060" w:val="clear"/>
           </w:tcPr>
@@ -556,7 +576,7 @@
         </w:trPr>
         <w:tc>
           <w:tcPr>
-            <w:tcW w:w="2193" w:type="dxa"/>
+            <w:tcW w:w="2192" w:type="dxa"/>
             <w:tcBorders/>
           </w:tcPr>
           <w:p>
@@ -584,7 +604,7 @@
         </w:tc>
         <w:tc>
           <w:tcPr>
-            <w:tcW w:w="2206" w:type="dxa"/>
+            <w:tcW w:w="2207" w:type="dxa"/>
             <w:tcBorders/>
           </w:tcPr>
           <w:p>
@@ -749,8 +769,8 @@
         <w:tblLook w:val="04a0" w:noHBand="0" w:noVBand="1" w:firstColumn="1" w:lastRow="0" w:lastColumn="0" w:firstRow="1"/>
       </w:tblPr>
       <w:tblGrid>
-        <w:gridCol w:w="2247"/>
-        <w:gridCol w:w="2163"/>
+        <w:gridCol w:w="2245"/>
+        <w:gridCol w:w="2165"/>
         <w:gridCol w:w="2250"/>
         <w:gridCol w:w="2070"/>
         <w:gridCol w:w="2160"/>
@@ -803,7 +823,7 @@
         </w:trPr>
         <w:tc>
           <w:tcPr>
-            <w:tcW w:w="2247" w:type="dxa"/>
+            <w:tcW w:w="2245" w:type="dxa"/>
             <w:tcBorders/>
             <w:shd w:color="auto" w:fill="2F4060" w:val="clear"/>
           </w:tcPr>
@@ -833,7 +853,7 @@
         </w:tc>
         <w:tc>
           <w:tcPr>
-            <w:tcW w:w="2163" w:type="dxa"/>
+            <w:tcW w:w="2165" w:type="dxa"/>
             <w:tcBorders/>
             <w:shd w:color="auto" w:fill="2F4060" w:val="clear"/>
           </w:tcPr>
@@ -958,7 +978,7 @@
         </w:trPr>
         <w:tc>
           <w:tcPr>
-            <w:tcW w:w="2247" w:type="dxa"/>
+            <w:tcW w:w="2245" w:type="dxa"/>
             <w:tcBorders/>
           </w:tcPr>
           <w:p>
@@ -987,7 +1007,7 @@
         </w:tc>
         <w:tc>
           <w:tcPr>
-            <w:tcW w:w="2163" w:type="dxa"/>
+            <w:tcW w:w="2165" w:type="dxa"/>
             <w:tcBorders/>
           </w:tcPr>
           <w:p>
@@ -1068,76 +1088,36 @@
                 <w:szCs w:val="18"/>
                 <w:lang w:val="es-PE" w:eastAsia="en-US" w:bidi="ar-SA"/>
               </w:rPr>
-              <w:t>{</w:t>
-            </w:r>
-            <w:r>
-              <w:rPr>
-                <w:rFonts w:eastAsia="Calibri" w:cs="Calibri" w:cstheme="minorHAnsi"/>
-                <w:kern w:val="2"/>
-                <w:sz w:val="20"/>
-                <w:szCs w:val="20"/>
-                <w:lang w:val="es-PE" w:eastAsia="en-US" w:bidi="ar-SA"/>
-              </w:rPr>
-              <w:t>Criterios</w:t>
-            </w:r>
-            <w:r>
-              <w:rPr>
-                <w:rFonts w:eastAsia="Calibri" w:cs="Arial"/>
-                <w:kern w:val="2"/>
+              <w:t>{Criterios}</w:t>
+            </w:r>
+          </w:p>
+        </w:tc>
+        <w:tc>
+          <w:tcPr>
+            <w:tcW w:w="2160" w:type="dxa"/>
+            <w:tcBorders/>
+          </w:tcPr>
+          <w:p>
+            <w:pPr>
+              <w:pStyle w:val="Normal"/>
+              <w:widowControl/>
+              <w:suppressAutoHyphens w:val="true"/>
+              <w:spacing w:lineRule="auto" w:line="240" w:before="0" w:after="0"/>
+              <w:jc w:val="left"/>
+              <w:rPr>
                 <w:sz w:val="18"/>
                 <w:szCs w:val="18"/>
-                <w:lang w:val="es-PE" w:eastAsia="en-US" w:bidi="ar-SA"/>
-              </w:rPr>
-              <w:t>}</w:t>
-            </w:r>
-          </w:p>
-        </w:tc>
-        <w:tc>
-          <w:tcPr>
-            <w:tcW w:w="2160" w:type="dxa"/>
-            <w:tcBorders/>
-          </w:tcPr>
-          <w:p>
-            <w:pPr>
-              <w:pStyle w:val="Normal"/>
-              <w:widowControl/>
-              <w:suppressAutoHyphens w:val="true"/>
-              <w:spacing w:lineRule="auto" w:line="240" w:before="0" w:after="0"/>
-              <w:jc w:val="left"/>
-              <w:rPr>
+              </w:rPr>
+            </w:pPr>
+            <w:r>
+              <w:rPr>
+                <w:rFonts w:eastAsia="Calibri" w:cs="Arial"/>
+                <w:kern w:val="2"/>
                 <w:sz w:val="18"/>
                 <w:szCs w:val="18"/>
-              </w:rPr>
-            </w:pPr>
-            <w:r>
-              <w:rPr>
-                <w:rFonts w:eastAsia="Calibri" w:cs="Arial"/>
-                <w:kern w:val="2"/>
-                <w:sz w:val="18"/>
-                <w:szCs w:val="18"/>
-                <w:lang w:val="es-PE" w:eastAsia="en-US" w:bidi="ar-SA"/>
-              </w:rPr>
-              <w:t>{</w:t>
-            </w:r>
-            <w:r>
-              <w:rPr>
-                <w:rFonts w:eastAsia="Calibri" w:cs="Calibri" w:cstheme="minorHAnsi"/>
-                <w:kern w:val="2"/>
-                <w:sz w:val="20"/>
-                <w:szCs w:val="20"/>
-                <w:lang w:val="es-PE" w:eastAsia="en-US" w:bidi="ar-SA"/>
-              </w:rPr>
-              <w:t>Evaluacion</w:t>
-            </w:r>
-            <w:r>
-              <w:rPr>
-                <w:rFonts w:eastAsia="Calibri" w:cs="Arial"/>
-                <w:kern w:val="2"/>
-                <w:sz w:val="18"/>
-                <w:szCs w:val="18"/>
-                <w:lang w:val="es-PE" w:eastAsia="en-US" w:bidi="ar-SA"/>
-              </w:rPr>
-              <w:t>}</w:t>
+                <w:lang w:val="es-PE" w:eastAsia="en-US" w:bidi="ar-SA"/>
+              </w:rPr>
+              <w:t>{Evaluacion}</w:t>
             </w:r>
           </w:p>
         </w:tc>
@@ -1218,7 +1198,7 @@
       </w:tr>
       <w:tr>
         <w:trPr>
-          <w:trHeight w:val="50" w:hRule="atLeast"/>
+          <w:trHeight w:val="245" w:hRule="atLeast"/>
         </w:trPr>
         <w:tc>
           <w:tcPr>
@@ -1245,27 +1225,7 @@
                 <w:szCs w:val="20"/>
                 <w:lang w:val="es-PE" w:eastAsia="en-US" w:bidi="ar-SA"/>
               </w:rPr>
-              <w:t>{</w:t>
-            </w:r>
-            <w:r>
-              <w:rPr>
-                <w:rFonts w:eastAsia="Calibri" w:cs="Calibri" w:cstheme="minorHAnsi"/>
-                <w:kern w:val="2"/>
-                <w:sz w:val="20"/>
-                <w:szCs w:val="20"/>
-                <w:lang w:val="es-PE" w:eastAsia="en-US" w:bidi="ar-SA"/>
-              </w:rPr>
-              <w:t>estandar</w:t>
-            </w:r>
-            <w:r>
-              <w:rPr>
-                <w:rFonts w:eastAsia="Calibri" w:cs="Arial"/>
-                <w:kern w:val="2"/>
-                <w:sz w:val="20"/>
-                <w:szCs w:val="20"/>
-                <w:lang w:val="es-PE" w:eastAsia="en-US" w:bidi="ar-SA"/>
-              </w:rPr>
-              <w:t>}</w:t>
+              <w:t>{estandar}</w:t>
             </w:r>
           </w:p>
         </w:tc>
@@ -1410,76 +1370,36 @@
                 <w:szCs w:val="18"/>
                 <w:lang w:val="es-PE" w:eastAsia="en-US" w:bidi="ar-SA"/>
               </w:rPr>
-              <w:t>{</w:t>
-            </w:r>
-            <w:r>
-              <w:rPr>
-                <w:rFonts w:eastAsia="Calibri" w:cs="Calibri" w:cstheme="minorHAnsi"/>
-                <w:kern w:val="2"/>
-                <w:sz w:val="20"/>
-                <w:szCs w:val="20"/>
-                <w:lang w:val="es-PE" w:eastAsia="en-US" w:bidi="ar-SA"/>
-              </w:rPr>
-              <w:t>proposito</w:t>
-            </w:r>
-            <w:r>
-              <w:rPr>
-                <w:rFonts w:eastAsia="Calibri" w:cs="Arial"/>
-                <w:kern w:val="2"/>
+              <w:t>{proposito}</w:t>
+            </w:r>
+          </w:p>
+        </w:tc>
+        <w:tc>
+          <w:tcPr>
+            <w:tcW w:w="5400" w:type="dxa"/>
+            <w:tcBorders/>
+          </w:tcPr>
+          <w:p>
+            <w:pPr>
+              <w:pStyle w:val="Normal"/>
+              <w:widowControl/>
+              <w:suppressAutoHyphens w:val="true"/>
+              <w:spacing w:lineRule="auto" w:line="240" w:before="0" w:after="0"/>
+              <w:jc w:val="left"/>
+              <w:rPr>
                 <w:sz w:val="18"/>
                 <w:szCs w:val="18"/>
-                <w:lang w:val="es-PE" w:eastAsia="en-US" w:bidi="ar-SA"/>
-              </w:rPr>
-              <w:t>}</w:t>
-            </w:r>
-          </w:p>
-        </w:tc>
-        <w:tc>
-          <w:tcPr>
-            <w:tcW w:w="5400" w:type="dxa"/>
-            <w:tcBorders/>
-          </w:tcPr>
-          <w:p>
-            <w:pPr>
-              <w:pStyle w:val="Normal"/>
-              <w:widowControl/>
-              <w:suppressAutoHyphens w:val="true"/>
-              <w:spacing w:lineRule="auto" w:line="240" w:before="0" w:after="0"/>
-              <w:jc w:val="left"/>
-              <w:rPr>
+              </w:rPr>
+            </w:pPr>
+            <w:r>
+              <w:rPr>
+                <w:rFonts w:eastAsia="Calibri" w:cs="Arial"/>
+                <w:kern w:val="2"/>
                 <w:sz w:val="18"/>
                 <w:szCs w:val="18"/>
-              </w:rPr>
-            </w:pPr>
-            <w:r>
-              <w:rPr>
-                <w:rFonts w:eastAsia="Calibri" w:cs="Arial"/>
-                <w:kern w:val="2"/>
-                <w:sz w:val="18"/>
-                <w:szCs w:val="18"/>
-                <w:lang w:val="es-PE" w:eastAsia="en-US" w:bidi="ar-SA"/>
-              </w:rPr>
-              <w:t>{</w:t>
-            </w:r>
-            <w:r>
-              <w:rPr>
-                <w:rFonts w:eastAsia="Calibri" w:cs="Calibri" w:cstheme="minorHAnsi"/>
-                <w:kern w:val="2"/>
-                <w:sz w:val="20"/>
-                <w:szCs w:val="20"/>
-                <w:lang w:val="es-PE" w:eastAsia="en-US" w:bidi="ar-SA"/>
-              </w:rPr>
-              <w:t>evidencia</w:t>
-            </w:r>
-            <w:r>
-              <w:rPr>
-                <w:rFonts w:eastAsia="Calibri" w:cs="Arial"/>
-                <w:kern w:val="2"/>
-                <w:sz w:val="18"/>
-                <w:szCs w:val="18"/>
-                <w:lang w:val="es-PE" w:eastAsia="en-US" w:bidi="ar-SA"/>
-              </w:rPr>
-              <w:t>}</w:t>
+                <w:lang w:val="es-PE" w:eastAsia="en-US" w:bidi="ar-SA"/>
+              </w:rPr>
+              <w:t>{evidencia}</w:t>
             </w:r>
           </w:p>
         </w:tc>
@@ -1626,76 +1546,36 @@
                 <w:szCs w:val="18"/>
                 <w:lang w:val="es-PE" w:eastAsia="en-US" w:bidi="ar-SA"/>
               </w:rPr>
-              <w:t>{</w:t>
-            </w:r>
-            <w:r>
-              <w:rPr>
-                <w:rFonts w:eastAsia="Calibri" w:cs="Calibri" w:cstheme="minorHAnsi"/>
-                <w:kern w:val="2"/>
-                <w:sz w:val="20"/>
-                <w:szCs w:val="20"/>
-                <w:lang w:val="es-PE" w:eastAsia="en-US" w:bidi="ar-SA"/>
-              </w:rPr>
-              <w:t>competenciastrans</w:t>
-            </w:r>
-            <w:r>
-              <w:rPr>
-                <w:rFonts w:eastAsia="Calibri" w:cs="Arial"/>
-                <w:kern w:val="2"/>
+              <w:t>{competenciastrans}</w:t>
+            </w:r>
+          </w:p>
+        </w:tc>
+        <w:tc>
+          <w:tcPr>
+            <w:tcW w:w="5400" w:type="dxa"/>
+            <w:tcBorders/>
+          </w:tcPr>
+          <w:p>
+            <w:pPr>
+              <w:pStyle w:val="Normal"/>
+              <w:widowControl/>
+              <w:suppressAutoHyphens w:val="true"/>
+              <w:spacing w:lineRule="auto" w:line="240" w:before="0" w:after="0"/>
+              <w:jc w:val="left"/>
+              <w:rPr>
                 <w:sz w:val="18"/>
                 <w:szCs w:val="18"/>
-                <w:lang w:val="es-PE" w:eastAsia="en-US" w:bidi="ar-SA"/>
-              </w:rPr>
-              <w:t>}</w:t>
-            </w:r>
-          </w:p>
-        </w:tc>
-        <w:tc>
-          <w:tcPr>
-            <w:tcW w:w="5400" w:type="dxa"/>
-            <w:tcBorders/>
-          </w:tcPr>
-          <w:p>
-            <w:pPr>
-              <w:pStyle w:val="Normal"/>
-              <w:widowControl/>
-              <w:suppressAutoHyphens w:val="true"/>
-              <w:spacing w:lineRule="auto" w:line="240" w:before="0" w:after="0"/>
-              <w:jc w:val="left"/>
-              <w:rPr>
+              </w:rPr>
+            </w:pPr>
+            <w:r>
+              <w:rPr>
+                <w:rFonts w:eastAsia="Calibri" w:cs="Arial"/>
+                <w:kern w:val="2"/>
                 <w:sz w:val="18"/>
                 <w:szCs w:val="18"/>
-              </w:rPr>
-            </w:pPr>
-            <w:r>
-              <w:rPr>
-                <w:rFonts w:eastAsia="Calibri" w:cs="Arial"/>
-                <w:kern w:val="2"/>
-                <w:sz w:val="18"/>
-                <w:szCs w:val="18"/>
-                <w:lang w:val="es-PE" w:eastAsia="en-US" w:bidi="ar-SA"/>
-              </w:rPr>
-              <w:t>{</w:t>
-            </w:r>
-            <w:r>
-              <w:rPr>
-                <w:rFonts w:eastAsia="Calibri" w:cs="Calibri" w:cstheme="minorHAnsi"/>
-                <w:kern w:val="2"/>
-                <w:sz w:val="20"/>
-                <w:szCs w:val="20"/>
-                <w:lang w:val="es-PE" w:eastAsia="en-US" w:bidi="ar-SA"/>
-              </w:rPr>
-              <w:t>capacidadestrans</w:t>
-            </w:r>
-            <w:r>
-              <w:rPr>
-                <w:rFonts w:eastAsia="Calibri" w:cs="Arial"/>
-                <w:kern w:val="2"/>
-                <w:sz w:val="18"/>
-                <w:szCs w:val="18"/>
-                <w:lang w:val="es-PE" w:eastAsia="en-US" w:bidi="ar-SA"/>
-              </w:rPr>
-              <w:t>}</w:t>
+                <w:lang w:val="es-PE" w:eastAsia="en-US" w:bidi="ar-SA"/>
+              </w:rPr>
+              <w:t>{capacidadestrans}</w:t>
             </w:r>
           </w:p>
         </w:tc>
@@ -1874,27 +1754,7 @@
                 <w:szCs w:val="22"/>
                 <w:lang w:val="es-PE" w:eastAsia="en-US" w:bidi="ar-SA"/>
               </w:rPr>
-              <w:t>{</w:t>
-            </w:r>
-            <w:r>
-              <w:rPr>
-                <w:rFonts w:eastAsia="Calibri" w:cs="Calibri" w:cstheme="minorHAnsi"/>
-                <w:kern w:val="2"/>
-                <w:sz w:val="20"/>
-                <w:szCs w:val="20"/>
-                <w:lang w:val="es-PE" w:eastAsia="en-US" w:bidi="ar-SA"/>
-              </w:rPr>
-              <w:t>enfoques</w:t>
-            </w:r>
-            <w:r>
-              <w:rPr>
-                <w:rFonts w:eastAsia="Calibri" w:cs="Arial"/>
-                <w:kern w:val="2"/>
-                <w:sz w:val="22"/>
-                <w:szCs w:val="22"/>
-                <w:lang w:val="es-PE" w:eastAsia="en-US" w:bidi="ar-SA"/>
-              </w:rPr>
-              <w:t>}</w:t>
+              <w:t>{enfoques}</w:t>
             </w:r>
           </w:p>
         </w:tc>
@@ -1955,27 +1815,7 @@
                 <w:szCs w:val="18"/>
                 <w:lang w:val="es-PE" w:eastAsia="en-US" w:bidi="ar-SA"/>
               </w:rPr>
-              <w:t>{</w:t>
-            </w:r>
-            <w:r>
-              <w:rPr>
-                <w:rFonts w:eastAsia="Calibri" w:cs="Calibri" w:cstheme="minorHAnsi"/>
-                <w:kern w:val="2"/>
-                <w:sz w:val="20"/>
-                <w:szCs w:val="20"/>
-                <w:lang w:val="es-PE" w:eastAsia="en-US" w:bidi="ar-SA"/>
-              </w:rPr>
-              <w:t>actitudes</w:t>
-            </w:r>
-            <w:r>
-              <w:rPr>
-                <w:rFonts w:eastAsia="Calibri" w:cs="Arial"/>
-                <w:kern w:val="2"/>
-                <w:sz w:val="18"/>
-                <w:szCs w:val="18"/>
-                <w:lang w:val="es-PE" w:eastAsia="en-US" w:bidi="ar-SA"/>
-              </w:rPr>
-              <w:t>}</w:t>
+              <w:t>{actitudes}</w:t>
             </w:r>
           </w:p>
         </w:tc>
@@ -2290,27 +2130,7 @@
                 <w:szCs w:val="18"/>
                 <w:lang w:val="es-PE" w:eastAsia="en-US" w:bidi="ar-SA"/>
               </w:rPr>
-              <w:t>{</w:t>
-            </w:r>
-            <w:r>
-              <w:rPr>
-                <w:rFonts w:eastAsia="Calibri" w:cs="Calibri" w:cstheme="minorHAnsi"/>
-                <w:kern w:val="2"/>
-                <w:sz w:val="20"/>
-                <w:szCs w:val="20"/>
-                <w:lang w:val="es-PE" w:eastAsia="en-US" w:bidi="ar-SA"/>
-              </w:rPr>
-              <w:t>tiempoinicio</w:t>
-            </w:r>
-            <w:r>
-              <w:rPr>
-                <w:rFonts w:eastAsia="Calibri" w:cs="Arial"/>
-                <w:kern w:val="2"/>
-                <w:sz w:val="18"/>
-                <w:szCs w:val="18"/>
-                <w:lang w:val="es-PE" w:eastAsia="en-US" w:bidi="ar-SA"/>
-              </w:rPr>
-              <w:t>}</w:t>
+              <w:t>{tiempoinicio}</w:t>
             </w:r>
           </w:p>
         </w:tc>
@@ -2405,27 +2225,7 @@
                 <w:szCs w:val="18"/>
                 <w:lang w:val="es-PE" w:eastAsia="en-US" w:bidi="ar-SA"/>
               </w:rPr>
-              <w:t>{</w:t>
-            </w:r>
-            <w:r>
-              <w:rPr>
-                <w:rFonts w:eastAsia="Calibri" w:cs="Calibri" w:cstheme="minorHAnsi"/>
-                <w:kern w:val="2"/>
-                <w:sz w:val="20"/>
-                <w:szCs w:val="20"/>
-                <w:lang w:val="es-PE" w:eastAsia="en-US" w:bidi="ar-SA"/>
-              </w:rPr>
-              <w:t>tiempodesarollo</w:t>
-            </w:r>
-            <w:r>
-              <w:rPr>
-                <w:rFonts w:eastAsia="Calibri" w:cs="Arial"/>
-                <w:kern w:val="2"/>
-                <w:sz w:val="18"/>
-                <w:szCs w:val="18"/>
-                <w:lang w:val="es-PE" w:eastAsia="en-US" w:bidi="ar-SA"/>
-              </w:rPr>
-              <w:t>}</w:t>
+              <w:t>{tiempodesarollo}</w:t>
             </w:r>
           </w:p>
         </w:tc>
@@ -2520,27 +2320,7 @@
                 <w:szCs w:val="18"/>
                 <w:lang w:val="es-PE" w:eastAsia="en-US" w:bidi="ar-SA"/>
               </w:rPr>
-              <w:t>{</w:t>
-            </w:r>
-            <w:r>
-              <w:rPr>
-                <w:rFonts w:eastAsia="Calibri" w:cs="Calibri" w:cstheme="minorHAnsi"/>
-                <w:kern w:val="2"/>
-                <w:sz w:val="20"/>
-                <w:szCs w:val="20"/>
-                <w:lang w:val="es-PE" w:eastAsia="en-US" w:bidi="ar-SA"/>
-              </w:rPr>
-              <w:t>tiempocierre</w:t>
-            </w:r>
-            <w:r>
-              <w:rPr>
-                <w:rFonts w:eastAsia="Calibri" w:cs="Arial"/>
-                <w:kern w:val="2"/>
-                <w:sz w:val="18"/>
-                <w:szCs w:val="18"/>
-                <w:lang w:val="es-PE" w:eastAsia="en-US" w:bidi="ar-SA"/>
-              </w:rPr>
-              <w:t>}</w:t>
+              <w:t>{tiempocierre}</w:t>
             </w:r>
           </w:p>
         </w:tc>
@@ -2674,27 +2454,7 @@
                 <w:szCs w:val="18"/>
                 <w:lang w:val="es-PE" w:eastAsia="en-US" w:bidi="ar-SA"/>
               </w:rPr>
-              <w:t>{</w:t>
-            </w:r>
-            <w:r>
-              <w:rPr>
-                <w:rFonts w:eastAsia="Calibri" w:cs="Calibri" w:cstheme="minorHAnsi"/>
-                <w:kern w:val="2"/>
-                <w:sz w:val="20"/>
-                <w:szCs w:val="20"/>
-                <w:lang w:val="es-PE" w:eastAsia="en-US" w:bidi="ar-SA"/>
-              </w:rPr>
-              <w:t>fichadeaprendizaje</w:t>
-            </w:r>
-            <w:r>
-              <w:rPr>
-                <w:rFonts w:eastAsia="Calibri" w:cs="Arial"/>
-                <w:kern w:val="2"/>
-                <w:sz w:val="18"/>
-                <w:szCs w:val="18"/>
-                <w:lang w:val="es-PE" w:eastAsia="en-US" w:bidi="ar-SA"/>
-              </w:rPr>
-              <w:t>}</w:t>
+              <w:t>{fichadeaprendizaje}</w:t>
             </w:r>
           </w:p>
         </w:tc>

</xml_diff>